<commit_message>
Cut eligibility restatement from Accenture resume
- Summary rewritten to open on quantified outcomes (120+ funds automated,
  5+ years reconciled, INR 4.2 lakh saved) and identify the candidate only
  afterwards; drops 'applying for the Analyst role' and 'no active backlogs'
- Education block: backlog tag removed; graduation year now stated once
- Achievement bullets untouched
- Editorial rule recorded in the content file and README, with a build-time
  audit of the phrases that must not reappear
- Still one page in both PDF and Word; PDF/DOCX text identical (1.0000)
</commit_message>
<xml_diff>
--- a/resume/S-K-Lokesh-Resume-Accenture.docx
+++ b/resume/S-K-Lokesh-Resume-Accenture.docx
@@ -96,7 +96,7 @@
           <w:color w:val="000000"/>
           <w:sz w:val="18"/>
         </w:rPr>
-        <w:t>Final-year B.Com student at St. Joseph’s College of Commerce, graduating in 2027 with no active backlogs, applying for the Analyst role at Accenture. Delivered finance operations and reporting work during an internship at India’s largest listed wealth manager: automated a recurring returns pack covering 120+ funds in Python (~90% less manual effort), reconciled 5+ years of transaction history for cost-basis accuracy, and modelled fee structures that surfaced INR 4.2 lakh of annual savings for one client. Independently built, audited and remediated a 6,500-line Python analytics platform. Brings an automation-first instinct, a controls mindset around reporting accuracy, and daily hands-on use of AI-enabled tools.</w:t>
+        <w:t>Automated a recurring returns pack covering 120+ funds in Python (~90% less manual effort), reconciled 5+ years of transaction history for cost-basis accuracy, and modelled fee structures that surfaced INR 4.2 lakh of annual savings for a client – delivered during a finance internship at India’s largest listed wealth manager. Independently built, audited and remediated a 6,500-line Python analytics platform, closing seven defects including an inverted risk structure in its own logic. Final-year B.Com student at St. Joseph’s College of Commerce, Bengaluru, with an automation-first instinct, a controls mindset around reporting accuracy, and daily hands-on use of AI-enabled tools.</w:t>
       </w:r>
     </w:p>
     <w:p>
@@ -168,7 +168,7 @@
           <w:color w:val="000000"/>
           <w:sz w:val="17"/>
         </w:rPr>
-        <w:t>Affiliated to Bengaluru City University  ·  NAAC A++ accredited  ·  Final year, graduating 2027  ·  no active backlogs</w:t>
+        <w:t>Affiliated to Bengaluru City University  ·  NAAC A++ accredited  ·  Final year, graduating 2027</w:t>
       </w:r>
     </w:p>
     <w:p>

</xml_diff>